<commit_message>
week 6 remaining and 7
</commit_message>
<xml_diff>
--- a/Introductory Programming and Problem Solvoing/Python/week 6/Workshop_6.2.docx
+++ b/Introductory Programming and Problem Solvoing/Python/week 6/Workshop_6.2.docx
@@ -498,6 +498,7 @@
       <w:r>
         <w:rPr>
           <w:rFonts w:ascii="Courier New" w:eastAsia="Courier New" w:hAnsi="Courier New" w:cs="Courier New"/>
+          <w:noProof/>
           <w:color w:val="000000"/>
           <w:sz w:val="28"/>
           <w:szCs w:val="28"/>
@@ -795,6 +796,7 @@
       <w:r>
         <w:rPr>
           <w:rFonts w:ascii="Courier New" w:eastAsia="Courier New" w:hAnsi="Courier New" w:cs="Courier New"/>
+          <w:noProof/>
           <w:color w:val="000000"/>
           <w:sz w:val="28"/>
           <w:szCs w:val="28"/>
@@ -897,6 +899,7 @@
       <w:r>
         <w:rPr>
           <w:rFonts w:ascii="Times New Roman" w:eastAsia="Times New Roman" w:hAnsi="Times New Roman" w:cs="Times New Roman"/>
+          <w:noProof/>
           <w:color w:val="000000"/>
           <w:sz w:val="28"/>
           <w:szCs w:val="28"/>
@@ -1077,6 +1080,7 @@
       <w:r>
         <w:rPr>
           <w:rFonts w:ascii="Times New Roman" w:eastAsia="Times New Roman" w:hAnsi="Times New Roman" w:cs="Times New Roman"/>
+          <w:noProof/>
           <w:color w:val="000000"/>
           <w:sz w:val="28"/>
           <w:szCs w:val="28"/>
@@ -1340,6 +1344,7 @@
       <w:r>
         <w:rPr>
           <w:rFonts w:ascii="Times New Roman" w:eastAsia="Times New Roman" w:hAnsi="Times New Roman" w:cs="Times New Roman"/>
+          <w:noProof/>
           <w:color w:val="000000"/>
           <w:sz w:val="28"/>
           <w:szCs w:val="28"/>
@@ -1442,6 +1447,7 @@
       <w:r>
         <w:rPr>
           <w:rFonts w:ascii="Times New Roman" w:eastAsia="Times New Roman" w:hAnsi="Times New Roman" w:cs="Times New Roman"/>
+          <w:noProof/>
           <w:color w:val="000000"/>
           <w:sz w:val="28"/>
           <w:szCs w:val="28"/>
@@ -1891,6 +1897,7 @@
         <w:rPr>
           <w:rFonts w:ascii="Times New Roman" w:eastAsia="Times New Roman" w:hAnsi="Times New Roman" w:cs="Times New Roman"/>
           <w:b/>
+          <w:noProof/>
           <w:color w:val="000000"/>
           <w:sz w:val="28"/>
           <w:szCs w:val="28"/>
@@ -2114,6 +2121,7 @@
           <w:rFonts w:ascii="Times New Roman" w:eastAsia="Times New Roman" w:hAnsi="Times New Roman" w:cs="Times New Roman"/>
           <w:b/>
           <w:bCs/>
+          <w:noProof/>
           <w:color w:val="000000"/>
           <w:sz w:val="28"/>
           <w:szCs w:val="28"/>
@@ -2861,6 +2869,26 @@
           <w:szCs w:val="28"/>
         </w:rPr>
       </w:pPr>
+    </w:p>
+    <w:p>
+      <w:pPr>
+        <w:widowControl w:val="0"/>
+        <w:pBdr>
+          <w:top w:val="nil"/>
+          <w:left w:val="nil"/>
+          <w:bottom w:val="nil"/>
+          <w:right w:val="nil"/>
+          <w:between w:val="nil"/>
+        </w:pBdr>
+        <w:spacing w:before="141" w:line="264" w:lineRule="auto"/>
+        <w:ind w:left="8" w:right="24" w:hanging="3"/>
+        <w:rPr>
+          <w:rFonts w:ascii="Times New Roman" w:eastAsia="Times New Roman" w:hAnsi="Times New Roman" w:cs="Times New Roman"/>
+          <w:color w:val="000000"/>
+          <w:sz w:val="28"/>
+          <w:szCs w:val="28"/>
+        </w:rPr>
+      </w:pPr>
       <w:r>
         <w:rPr>
           <w:rFonts w:ascii="Times New Roman" w:eastAsia="Times New Roman" w:hAnsi="Times New Roman" w:cs="Times New Roman"/>
@@ -3663,6 +3691,7 @@
           <w:sz w:val="28"/>
           <w:szCs w:val="28"/>
         </w:rPr>
+        <w:lastRenderedPageBreak/>
         <w:t xml:space="preserve">if temperature &lt;= 45: </w:t>
       </w:r>
     </w:p>
@@ -3693,7 +3722,6 @@
           <w:sz w:val="28"/>
           <w:szCs w:val="28"/>
         </w:rPr>
-        <w:lastRenderedPageBreak/>
         <w:t xml:space="preserve">print ('cold today') </w:t>
       </w:r>
     </w:p>

</xml_diff>